<commit_message>
e2e: Word's column changes into another count stay on Word's page (ADR 029)
plugin-doc cff91d3 lowers a section going straight from one multi-column
layout to another as a second split block (core d4311c7 ends a block where
the count or a gutter changes). AC-DOCCOL-2 now expects Word's 13 pages for
columns_docx() (it gained cases Q and R: two sections in a row with the same
columns, which share one column flow), with H3 balanced 3 / 3 / 1 directly
below H2 on page 1. The harness doc-columns.docx is the regenerated fixture.

Verified on a local protocol-64 engine (core-p64, includes d4311c7): all ten
doc-*.spec.ts pass.

Co-Authored-By: Claude Opus 5.5 <noreply@anthropic.com>
Claude-Session: https://claude.ai/code/session_01Mf28fFus6uCCCSqzdsn5Cj
</commit_message>
<xml_diff>
--- a/apps/canvas/tests/e2e/harness/doc-columns.docx
+++ b/apps/canvas/tests/e2e/harness/doc-columns.docx
@@ -2259,6 +2259,348 @@
           <w:sz w:val="20"/>
         </w:rPr>
         <w:t xml:space="preserve">P4-01</w:t>
+      </w:r>
+    </w:p>
+    <w:p>
+      <w:pPr>
+        <w:spacing w:before="0" w:after="0" w:line="240" w:lineRule="exact"/>
+      </w:pPr>
+      <w:r>
+        <w:rPr>
+          <w:rFonts w:ascii="Inter" w:hAnsi="Inter" w:cs="Inter"/>
+          <w:sz w:val="20"/>
+        </w:rPr>
+        <w:t xml:space="preserve">Q1-01</w:t>
+      </w:r>
+    </w:p>
+    <w:p>
+      <w:pPr>
+        <w:spacing w:before="0" w:after="0" w:line="240" w:lineRule="exact"/>
+        <w:sectPr>
+          <w:type w:val="nextPage"/>
+          <w:pgSz w:w="7200" w:h="6240"/>
+          <w:pgMar w:top="720" w:right="720" w:bottom="720" w:left="720" w:header="360" w:footer="360" w:gutter="0"/>
+          <w:cols w:num="1" w:space="720"/>
+        </w:sectPr>
+      </w:pPr>
+      <w:r>
+        <w:rPr>
+          <w:rFonts w:ascii="Inter" w:hAnsi="Inter" w:cs="Inter"/>
+          <w:sz w:val="20"/>
+        </w:rPr>
+        <w:t xml:space="preserve">Q1-02</w:t>
+      </w:r>
+    </w:p>
+    <w:p>
+      <w:pPr>
+        <w:spacing w:before="0" w:after="0" w:line="240" w:lineRule="exact"/>
+      </w:pPr>
+      <w:r>
+        <w:rPr>
+          <w:rFonts w:ascii="Inter" w:hAnsi="Inter" w:cs="Inter"/>
+          <w:sz w:val="20"/>
+        </w:rPr>
+        <w:t xml:space="preserve">Q2-01</w:t>
+      </w:r>
+    </w:p>
+    <w:p>
+      <w:pPr>
+        <w:spacing w:before="0" w:after="0" w:line="240" w:lineRule="exact"/>
+      </w:pPr>
+      <w:r>
+        <w:rPr>
+          <w:rFonts w:ascii="Inter" w:hAnsi="Inter" w:cs="Inter"/>
+          <w:sz w:val="20"/>
+        </w:rPr>
+        <w:t xml:space="preserve">Q2-02</w:t>
+      </w:r>
+    </w:p>
+    <w:p>
+      <w:pPr>
+        <w:spacing w:before="0" w:after="0" w:line="240" w:lineRule="exact"/>
+      </w:pPr>
+      <w:r>
+        <w:rPr>
+          <w:rFonts w:ascii="Inter" w:hAnsi="Inter" w:cs="Inter"/>
+          <w:sz w:val="20"/>
+        </w:rPr>
+        <w:t xml:space="preserve">Q2-03</w:t>
+      </w:r>
+    </w:p>
+    <w:p>
+      <w:pPr>
+        <w:spacing w:before="0" w:after="0" w:line="240" w:lineRule="exact"/>
+      </w:pPr>
+      <w:r>
+        <w:rPr>
+          <w:rFonts w:ascii="Inter" w:hAnsi="Inter" w:cs="Inter"/>
+          <w:sz w:val="20"/>
+        </w:rPr>
+        <w:t xml:space="preserve">Q2-04</w:t>
+      </w:r>
+    </w:p>
+    <w:p>
+      <w:pPr>
+        <w:spacing w:before="0" w:after="0" w:line="240" w:lineRule="exact"/>
+        <w:sectPr>
+          <w:type w:val="continuous"/>
+          <w:pgSz w:w="7200" w:h="6240"/>
+          <w:pgMar w:top="720" w:right="720" w:bottom="720" w:left="720" w:header="360" w:footer="360" w:gutter="0"/>
+          <w:cols w:num="2" w:space="720"/>
+        </w:sectPr>
+      </w:pPr>
+      <w:r>
+        <w:rPr>
+          <w:rFonts w:ascii="Inter" w:hAnsi="Inter" w:cs="Inter"/>
+          <w:sz w:val="20"/>
+        </w:rPr>
+        <w:t xml:space="preserve">Q2-05</w:t>
+      </w:r>
+    </w:p>
+    <w:p>
+      <w:pPr>
+        <w:spacing w:before="0" w:after="0" w:line="240" w:lineRule="exact"/>
+      </w:pPr>
+      <w:r>
+        <w:rPr>
+          <w:rFonts w:ascii="Inter" w:hAnsi="Inter" w:cs="Inter"/>
+          <w:sz w:val="20"/>
+        </w:rPr>
+        <w:t xml:space="preserve">Q3-01</w:t>
+      </w:r>
+    </w:p>
+    <w:p>
+      <w:pPr>
+        <w:spacing w:before="0" w:after="0" w:line="240" w:lineRule="exact"/>
+      </w:pPr>
+      <w:r>
+        <w:rPr>
+          <w:rFonts w:ascii="Inter" w:hAnsi="Inter" w:cs="Inter"/>
+          <w:sz w:val="20"/>
+        </w:rPr>
+        <w:t xml:space="preserve">Q3-02</w:t>
+      </w:r>
+    </w:p>
+    <w:p>
+      <w:pPr>
+        <w:spacing w:before="0" w:after="0" w:line="240" w:lineRule="exact"/>
+      </w:pPr>
+      <w:r>
+        <w:rPr>
+          <w:rFonts w:ascii="Inter" w:hAnsi="Inter" w:cs="Inter"/>
+          <w:sz w:val="20"/>
+        </w:rPr>
+        <w:t xml:space="preserve">Q3-03</w:t>
+      </w:r>
+    </w:p>
+    <w:p>
+      <w:pPr>
+        <w:spacing w:before="0" w:after="0" w:line="240" w:lineRule="exact"/>
+      </w:pPr>
+      <w:r>
+        <w:rPr>
+          <w:rFonts w:ascii="Inter" w:hAnsi="Inter" w:cs="Inter"/>
+          <w:sz w:val="20"/>
+        </w:rPr>
+        <w:t xml:space="preserve">Q3-04</w:t>
+      </w:r>
+    </w:p>
+    <w:p>
+      <w:pPr>
+        <w:spacing w:before="0" w:after="0" w:line="240" w:lineRule="exact"/>
+        <w:sectPr>
+          <w:type w:val="continuous"/>
+          <w:pgSz w:w="7200" w:h="6240"/>
+          <w:pgMar w:top="720" w:right="720" w:bottom="720" w:left="720" w:header="360" w:footer="360" w:gutter="0"/>
+          <w:cols w:num="2" w:space="720"/>
+        </w:sectPr>
+      </w:pPr>
+      <w:r>
+        <w:rPr>
+          <w:rFonts w:ascii="Inter" w:hAnsi="Inter" w:cs="Inter"/>
+          <w:sz w:val="20"/>
+        </w:rPr>
+        <w:t xml:space="preserve">Q3-05</w:t>
+      </w:r>
+    </w:p>
+    <w:p>
+      <w:pPr>
+        <w:spacing w:before="0" w:after="0" w:line="240" w:lineRule="exact"/>
+        <w:sectPr>
+          <w:type w:val="continuous"/>
+          <w:pgSz w:w="7200" w:h="6240"/>
+          <w:pgMar w:top="720" w:right="720" w:bottom="720" w:left="720" w:header="360" w:footer="360" w:gutter="0"/>
+          <w:cols w:num="1" w:space="720"/>
+        </w:sectPr>
+      </w:pPr>
+      <w:r>
+        <w:rPr>
+          <w:rFonts w:ascii="Inter" w:hAnsi="Inter" w:cs="Inter"/>
+          <w:sz w:val="20"/>
+        </w:rPr>
+        <w:t xml:space="preserve">Q4-01</w:t>
+      </w:r>
+    </w:p>
+    <w:p>
+      <w:pPr>
+        <w:spacing w:before="0" w:after="0" w:line="240" w:lineRule="exact"/>
+      </w:pPr>
+      <w:r>
+        <w:rPr>
+          <w:rFonts w:ascii="Inter" w:hAnsi="Inter" w:cs="Inter"/>
+          <w:sz w:val="20"/>
+        </w:rPr>
+        <w:t xml:space="preserve">R1-01</w:t>
+      </w:r>
+    </w:p>
+    <w:p>
+      <w:pPr>
+        <w:spacing w:before="0" w:after="0" w:line="240" w:lineRule="exact"/>
+        <w:sectPr>
+          <w:type w:val="nextPage"/>
+          <w:pgSz w:w="7200" w:h="6240"/>
+          <w:pgMar w:top="720" w:right="720" w:bottom="720" w:left="720" w:header="360" w:footer="360" w:gutter="0"/>
+          <w:cols w:num="1" w:space="720"/>
+        </w:sectPr>
+      </w:pPr>
+      <w:r>
+        <w:rPr>
+          <w:rFonts w:ascii="Inter" w:hAnsi="Inter" w:cs="Inter"/>
+          <w:sz w:val="20"/>
+        </w:rPr>
+        <w:t xml:space="preserve">R1-02</w:t>
+      </w:r>
+    </w:p>
+    <w:p>
+      <w:pPr>
+        <w:spacing w:before="0" w:after="0" w:line="240" w:lineRule="exact"/>
+      </w:pPr>
+      <w:r>
+        <w:rPr>
+          <w:rFonts w:ascii="Inter" w:hAnsi="Inter" w:cs="Inter"/>
+          <w:sz w:val="20"/>
+        </w:rPr>
+        <w:t xml:space="preserve">R2-01</w:t>
+      </w:r>
+    </w:p>
+    <w:p>
+      <w:pPr>
+        <w:spacing w:before="0" w:after="0" w:line="240" w:lineRule="exact"/>
+      </w:pPr>
+      <w:r>
+        <w:rPr>
+          <w:rFonts w:ascii="Inter" w:hAnsi="Inter" w:cs="Inter"/>
+          <w:sz w:val="20"/>
+        </w:rPr>
+        <w:t xml:space="preserve">R2-02</w:t>
+      </w:r>
+    </w:p>
+    <w:p>
+      <w:pPr>
+        <w:spacing w:before="0" w:after="0" w:line="240" w:lineRule="exact"/>
+      </w:pPr>
+      <w:r>
+        <w:rPr>
+          <w:rFonts w:ascii="Inter" w:hAnsi="Inter" w:cs="Inter"/>
+          <w:sz w:val="20"/>
+        </w:rPr>
+        <w:t xml:space="preserve">R2-03</w:t>
+      </w:r>
+    </w:p>
+    <w:p>
+      <w:pPr>
+        <w:spacing w:before="0" w:after="0" w:line="240" w:lineRule="exact"/>
+      </w:pPr>
+      <w:r>
+        <w:rPr>
+          <w:rFonts w:ascii="Inter" w:hAnsi="Inter" w:cs="Inter"/>
+          <w:sz w:val="20"/>
+        </w:rPr>
+        <w:t xml:space="preserve">R2-04</w:t>
+      </w:r>
+    </w:p>
+    <w:p>
+      <w:pPr>
+        <w:spacing w:before="0" w:after="0" w:line="240" w:lineRule="exact"/>
+        <w:sectPr>
+          <w:type w:val="continuous"/>
+          <w:pgSz w:w="7200" w:h="6240"/>
+          <w:pgMar w:top="720" w:right="720" w:bottom="720" w:left="720" w:header="360" w:footer="360" w:gutter="0"/>
+          <w:cols w:num="2" w:space="720"/>
+        </w:sectPr>
+      </w:pPr>
+      <w:r>
+        <w:rPr>
+          <w:rFonts w:ascii="Inter" w:hAnsi="Inter" w:cs="Inter"/>
+          <w:sz w:val="20"/>
+        </w:rPr>
+        <w:t xml:space="preserve">R2-05</w:t>
+      </w:r>
+    </w:p>
+    <w:p>
+      <w:pPr>
+        <w:spacing w:before="0" w:after="0" w:line="240" w:lineRule="exact"/>
+      </w:pPr>
+      <w:r>
+        <w:rPr>
+          <w:rFonts w:ascii="Inter" w:hAnsi="Inter" w:cs="Inter"/>
+          <w:sz w:val="20"/>
+        </w:rPr>
+        <w:t xml:space="preserve">R3-01</w:t>
+      </w:r>
+    </w:p>
+    <w:p>
+      <w:pPr>
+        <w:spacing w:before="0" w:after="0" w:line="240" w:lineRule="exact"/>
+      </w:pPr>
+      <w:r>
+        <w:rPr>
+          <w:rFonts w:ascii="Inter" w:hAnsi="Inter" w:cs="Inter"/>
+          <w:sz w:val="20"/>
+        </w:rPr>
+        <w:t xml:space="preserve">R3-02</w:t>
+      </w:r>
+    </w:p>
+    <w:p>
+      <w:pPr>
+        <w:spacing w:before="0" w:after="0" w:line="240" w:lineRule="exact"/>
+      </w:pPr>
+      <w:r>
+        <w:rPr>
+          <w:rFonts w:ascii="Inter" w:hAnsi="Inter" w:cs="Inter"/>
+          <w:sz w:val="20"/>
+        </w:rPr>
+        <w:t xml:space="preserve">R3-03</w:t>
+      </w:r>
+    </w:p>
+    <w:p>
+      <w:pPr>
+        <w:spacing w:before="0" w:after="0" w:line="240" w:lineRule="exact"/>
+      </w:pPr>
+      <w:r>
+        <w:rPr>
+          <w:rFonts w:ascii="Inter" w:hAnsi="Inter" w:cs="Inter"/>
+          <w:sz w:val="20"/>
+        </w:rPr>
+        <w:t xml:space="preserve">R3-04</w:t>
+      </w:r>
+    </w:p>
+    <w:p>
+      <w:pPr>
+        <w:spacing w:before="0" w:after="0" w:line="240" w:lineRule="exact"/>
+        <w:sectPr>
+          <w:type w:val="continuous"/>
+          <w:pgSz w:w="7200" w:h="6240"/>
+          <w:pgMar w:top="720" w:right="720" w:bottom="720" w:left="720" w:header="360" w:footer="360" w:gutter="0"/>
+          <w:cols w:num="2" w:space="720"/>
+        </w:sectPr>
+      </w:pPr>
+      <w:r>
+        <w:rPr>
+          <w:rFonts w:ascii="Inter" w:hAnsi="Inter" w:cs="Inter"/>
+          <w:sz w:val="20"/>
+        </w:rPr>
+        <w:t xml:space="preserve">R3-05</w:t>
       </w:r>
     </w:p>
     <w:p>

</xml_diff>